<commit_message>
modificación de la presentacion de proyecto
</commit_message>
<xml_diff>
--- a/Presentación de Proyecto.docx
+++ b/Presentación de Proyecto.docx
@@ -25,45 +25,75 @@
     <w:p>
       <w:pPr>
         <w:jc w:val="both"/>
-      </w:pPr>
-      <w:r>
-        <w:rPr>
-          <w:b/>
-          <w:bCs/>
+        <w:rPr>
+          <w:sz w:val="22"/>
+          <w:szCs w:val="22"/>
+        </w:rPr>
+      </w:pPr>
+      <w:r>
+        <w:rPr>
+          <w:b/>
+          <w:bCs/>
+          <w:sz w:val="22"/>
+          <w:szCs w:val="22"/>
         </w:rPr>
         <w:t>Integrantes:</w:t>
       </w:r>
       <w:r>
+        <w:rPr>
+          <w:sz w:val="22"/>
+          <w:szCs w:val="22"/>
+        </w:rPr>
         <w:t xml:space="preserve"> Daniel Trigo Tabilo, Nicolás Lobos Gahona.</w:t>
       </w:r>
     </w:p>
     <w:p>
       <w:pPr>
         <w:jc w:val="both"/>
-      </w:pPr>
-      <w:r>
-        <w:rPr>
-          <w:b/>
-          <w:bCs/>
+        <w:rPr>
+          <w:sz w:val="22"/>
+          <w:szCs w:val="22"/>
+        </w:rPr>
+      </w:pPr>
+      <w:r>
+        <w:rPr>
+          <w:b/>
+          <w:bCs/>
+          <w:sz w:val="22"/>
+          <w:szCs w:val="22"/>
         </w:rPr>
         <w:t>Nombre Grupo:</w:t>
       </w:r>
       <w:r>
+        <w:rPr>
+          <w:sz w:val="22"/>
+          <w:szCs w:val="22"/>
+        </w:rPr>
         <w:t xml:space="preserve"> Border_Radius.</w:t>
       </w:r>
     </w:p>
     <w:p>
       <w:pPr>
         <w:jc w:val="both"/>
-      </w:pPr>
-      <w:r>
-        <w:rPr>
-          <w:b/>
-          <w:bCs/>
+        <w:rPr>
+          <w:sz w:val="22"/>
+          <w:szCs w:val="22"/>
+        </w:rPr>
+      </w:pPr>
+      <w:r>
+        <w:rPr>
+          <w:b/>
+          <w:bCs/>
+          <w:sz w:val="22"/>
+          <w:szCs w:val="22"/>
         </w:rPr>
         <w:t>Curso:</w:t>
       </w:r>
       <w:r>
+        <w:rPr>
+          <w:sz w:val="22"/>
+          <w:szCs w:val="22"/>
+        </w:rPr>
         <w:t xml:space="preserve"> Proyecto Desarrollo Ágil.</w:t>
       </w:r>
     </w:p>
@@ -84,36 +114,18 @@
           <w:sz w:val="28"/>
           <w:szCs w:val="28"/>
         </w:rPr>
-        <w:t>Descripción del proyecto</w:t>
-      </w:r>
-    </w:p>
-    <w:p>
-      <w:pPr>
-        <w:jc w:val="both"/>
-      </w:pPr>
-      <w:r>
-        <w:t xml:space="preserve">Este proyecto </w:t>
-      </w:r>
-      <w:r>
-        <w:t>tiene como objetivo</w:t>
-      </w:r>
-      <w:r>
-        <w:t xml:space="preserve"> el desarrollo de una aplicación tipo Marketplace académico, en donde participarán estudiantes y profesores. </w:t>
-      </w:r>
-      <w:r>
-        <w:t>Esta aplicación permitirá centralizar información relevante de</w:t>
-      </w:r>
-      <w:r>
-        <w:t>l</w:t>
-      </w:r>
-      <w:r>
-        <w:t xml:space="preserve"> entorno universitario, como materiales del curso, comunicación entre estudiantes y profesores</w:t>
-      </w:r>
-      <w:r>
-        <w:t xml:space="preserve">, </w:t>
-      </w:r>
-      <w:r>
-        <w:t>pasantías u oportunidades laborales relacionadas con cada carrera.</w:t>
+        <w:t>Problemática</w:t>
+      </w:r>
+    </w:p>
+    <w:p>
+      <w:pPr>
+        <w:jc w:val="both"/>
+      </w:pPr>
+      <w:r>
+        <w:t xml:space="preserve">Actualmente la información relevante académica como material de estudio, organización de grupos, comunicación directa con profesores, oportunidades de prácticas o trabajos están </w:t>
+      </w:r>
+      <w:r>
+        <w:t>dispersos por distintas plataformas, por lo que se dificulta al acceso rápido y organización de la información, junto con la comunicación entre estudiantes y profesores.</w:t>
       </w:r>
     </w:p>
     <w:p>
@@ -125,6 +137,265 @@
           <w:sz w:val="28"/>
           <w:szCs w:val="28"/>
         </w:rPr>
+      </w:pPr>
+      <w:r>
+        <w:rPr>
+          <w:b/>
+          <w:bCs/>
+          <w:sz w:val="28"/>
+          <w:szCs w:val="28"/>
+        </w:rPr>
+        <w:t>Descripción del proyecto</w:t>
+      </w:r>
+    </w:p>
+    <w:p>
+      <w:pPr>
+        <w:jc w:val="both"/>
+      </w:pPr>
+      <w:r>
+        <w:t xml:space="preserve">Este proyecto </w:t>
+      </w:r>
+      <w:r>
+        <w:t>tiene como objetivo</w:t>
+      </w:r>
+      <w:r>
+        <w:t xml:space="preserve"> el desarrollo de una aplicación tipo Marketplace académico, en donde participarán estudiantes y profesores. </w:t>
+      </w:r>
+      <w:r>
+        <w:t>Esta aplicación permitirá centralizar información relevante de</w:t>
+      </w:r>
+      <w:r>
+        <w:t>l</w:t>
+      </w:r>
+      <w:r>
+        <w:t xml:space="preserve"> entorno universitario, como materiales del curso, comunicación entre estudiantes y profesores</w:t>
+      </w:r>
+      <w:r>
+        <w:t xml:space="preserve">, </w:t>
+      </w:r>
+      <w:r>
+        <w:t>p</w:t>
+      </w:r>
+      <w:r>
+        <w:t>rácticas</w:t>
+      </w:r>
+      <w:r>
+        <w:t xml:space="preserve"> u oportunidades laborales relacionadas con cada carrera.</w:t>
+      </w:r>
+    </w:p>
+    <w:p>
+      <w:pPr>
+        <w:jc w:val="both"/>
+      </w:pPr>
+    </w:p>
+    <w:p>
+      <w:pPr>
+        <w:jc w:val="both"/>
+        <w:rPr>
+          <w:b/>
+          <w:bCs/>
+          <w:sz w:val="28"/>
+          <w:szCs w:val="28"/>
+        </w:rPr>
+      </w:pPr>
+      <w:r>
+        <w:rPr>
+          <w:b/>
+          <w:bCs/>
+          <w:sz w:val="28"/>
+          <w:szCs w:val="28"/>
+        </w:rPr>
+        <w:t>Principales Actores</w:t>
+      </w:r>
+    </w:p>
+    <w:p>
+      <w:pPr>
+        <w:jc w:val="both"/>
+      </w:pPr>
+      <w:r>
+        <w:t>A las personas que está dirigida el proyecto son:</w:t>
+      </w:r>
+    </w:p>
+    <w:p>
+      <w:pPr>
+        <w:pStyle w:val="Prrafodelista"/>
+        <w:numPr>
+          <w:ilvl w:val="0"/>
+          <w:numId w:val="5"/>
+        </w:numPr>
+        <w:jc w:val="both"/>
+      </w:pPr>
+      <w:r>
+        <w:rPr>
+          <w:b/>
+          <w:bCs/>
+        </w:rPr>
+        <w:t>Estudiantes:</w:t>
+      </w:r>
+      <w:r>
+        <w:t xml:space="preserve"> buscan información, forman grupos, buscan prácticas, etc.</w:t>
+      </w:r>
+    </w:p>
+    <w:p>
+      <w:pPr>
+        <w:pStyle w:val="Prrafodelista"/>
+        <w:numPr>
+          <w:ilvl w:val="0"/>
+          <w:numId w:val="5"/>
+        </w:numPr>
+        <w:jc w:val="both"/>
+      </w:pPr>
+      <w:r>
+        <w:rPr>
+          <w:b/>
+          <w:bCs/>
+        </w:rPr>
+        <w:t>Profesores:</w:t>
+      </w:r>
+      <w:r>
+        <w:t xml:space="preserve"> comparten información, validan prácticas, ayudan a estudiantes. </w:t>
+      </w:r>
+    </w:p>
+    <w:p>
+      <w:pPr>
+        <w:pStyle w:val="Prrafodelista"/>
+        <w:jc w:val="both"/>
+      </w:pPr>
+    </w:p>
+    <w:p>
+      <w:pPr>
+        <w:jc w:val="both"/>
+        <w:rPr>
+          <w:b/>
+          <w:bCs/>
+          <w:sz w:val="28"/>
+          <w:szCs w:val="28"/>
+        </w:rPr>
+      </w:pPr>
+      <w:r>
+        <w:rPr>
+          <w:b/>
+          <w:bCs/>
+          <w:sz w:val="28"/>
+          <w:szCs w:val="28"/>
+        </w:rPr>
+        <w:t>Impacto</w:t>
+      </w:r>
+      <w:r>
+        <w:rPr>
+          <w:b/>
+          <w:bCs/>
+          <w:sz w:val="28"/>
+          <w:szCs w:val="28"/>
+        </w:rPr>
+        <w:t xml:space="preserve"> hoy en día</w:t>
+      </w:r>
+    </w:p>
+    <w:p>
+      <w:pPr>
+        <w:jc w:val="both"/>
+      </w:pPr>
+      <w:r>
+        <w:t>Actualmente, tanto estudiante y profesores tienen dificultades al no estar centralizada la información, como por ejemplo:</w:t>
+      </w:r>
+    </w:p>
+    <w:p>
+      <w:pPr>
+        <w:pStyle w:val="Prrafodelista"/>
+        <w:numPr>
+          <w:ilvl w:val="0"/>
+          <w:numId w:val="6"/>
+        </w:numPr>
+        <w:jc w:val="both"/>
+      </w:pPr>
+      <w:r>
+        <w:t>Pérdida de tiempo en la búsqueda de material de estudio.</w:t>
+      </w:r>
+    </w:p>
+    <w:p>
+      <w:pPr>
+        <w:pStyle w:val="Prrafodelista"/>
+        <w:numPr>
+          <w:ilvl w:val="0"/>
+          <w:numId w:val="6"/>
+        </w:numPr>
+        <w:jc w:val="both"/>
+      </w:pPr>
+      <w:r>
+        <w:t>Desorganización en la comunicación entre estudiantes y docentes.</w:t>
+      </w:r>
+    </w:p>
+    <w:p>
+      <w:pPr>
+        <w:pStyle w:val="Prrafodelista"/>
+        <w:numPr>
+          <w:ilvl w:val="0"/>
+          <w:numId w:val="6"/>
+        </w:numPr>
+        <w:jc w:val="both"/>
+      </w:pPr>
+      <w:r>
+        <w:t>Dificultad para encontrar oportunidades de prácticas adecuadas</w:t>
+      </w:r>
+      <w:r>
+        <w:t>.</w:t>
+      </w:r>
+    </w:p>
+    <w:p>
+      <w:pPr>
+        <w:pStyle w:val="Prrafodelista"/>
+        <w:numPr>
+          <w:ilvl w:val="0"/>
+          <w:numId w:val="6"/>
+        </w:numPr>
+        <w:jc w:val="both"/>
+      </w:pPr>
+      <w:r>
+        <w:t>Problemas para coordinar trabajos en grupo</w:t>
+      </w:r>
+    </w:p>
+    <w:p>
+      <w:pPr>
+        <w:jc w:val="both"/>
+      </w:pPr>
+    </w:p>
+    <w:p>
+      <w:pPr>
+        <w:jc w:val="both"/>
+        <w:rPr>
+          <w:b/>
+          <w:bCs/>
+          <w:sz w:val="28"/>
+          <w:szCs w:val="28"/>
+        </w:rPr>
+      </w:pPr>
+      <w:r>
+        <w:rPr>
+          <w:b/>
+          <w:bCs/>
+          <w:sz w:val="28"/>
+          <w:szCs w:val="28"/>
+        </w:rPr>
+        <w:lastRenderedPageBreak/>
+        <w:t>Alcance MVP</w:t>
+      </w:r>
+    </w:p>
+    <w:p>
+      <w:pPr>
+        <w:jc w:val="both"/>
+      </w:pPr>
+      <w:r>
+        <w:t>El MVP incluirá registro de usuarios, filtrado por escuela, acceso a canales, un foro básico para compartir material y una sección simple de publicación de prácticas. Funcionalidades avanzadas como chat en tiempo real y sistemas complejos de recomendación quedarán fuera de esta etapa.</w:t>
+      </w:r>
+    </w:p>
+    <w:p>
+      <w:pPr>
+        <w:jc w:val="both"/>
+      </w:pPr>
+    </w:p>
+    <w:p>
+      <w:pPr>
+        <w:jc w:val="both"/>
       </w:pPr>
       <w:r>
         <w:rPr>
@@ -283,14 +554,7 @@
           <w:b/>
           <w:bCs/>
         </w:rPr>
-        <w:t>Sección de ofertas profesores-estudiantes</w:t>
-      </w:r>
-      <w:r>
-        <w:rPr>
-          <w:b/>
-          <w:bCs/>
-        </w:rPr>
-        <w:t xml:space="preserve">: </w:t>
+        <w:t xml:space="preserve">Sección de ofertas profesores-estudiantes: </w:t>
       </w:r>
       <w:r>
         <w:t>Se implementan chats/canales para comunicación y separación de temas.</w:t>
@@ -336,16 +600,7 @@
         <w:t xml:space="preserve"> </w:t>
       </w:r>
       <w:r>
-        <w:t>La aplicación tendrá</w:t>
-      </w:r>
-      <w:r>
-        <w:t xml:space="preserve"> un</w:t>
-      </w:r>
-      <w:r>
-        <w:t>a sección en donde</w:t>
-      </w:r>
-      <w:r>
-        <w:t>:</w:t>
+        <w:t>La aplicación tendrá una sección en donde:</w:t>
       </w:r>
     </w:p>
     <w:p>
@@ -371,13 +626,7 @@
         <w:jc w:val="both"/>
       </w:pPr>
       <w:r>
-        <w:t>Profesores podrán evaluar si dichas oportunidades se ajustan al perfil de la</w:t>
-      </w:r>
-      <w:r>
-        <w:t xml:space="preserve"> </w:t>
-      </w:r>
-      <w:r>
-        <w:t>carrera.</w:t>
+        <w:t>Profesores podrán evaluar si dichas oportunidades se ajustan al perfil de la carrera.</w:t>
       </w:r>
     </w:p>
     <w:p>
@@ -390,18 +639,322 @@
         <w:jc w:val="both"/>
       </w:pPr>
       <w:r>
-        <w:t>También se podrá utilizar para organizar grupos de trabajo entre estudiantes</w:t>
-      </w:r>
-      <w:r>
-        <w:t xml:space="preserve"> para alguna asignatura específica</w:t>
-      </w:r>
-      <w:r>
-        <w:t>.</w:t>
-      </w:r>
-    </w:p>
-    <w:p>
-      <w:pPr>
-        <w:pStyle w:val="Prrafodelista"/>
+        <w:t>También se podrá utilizar para organizar grupos de trabajo entre estudiantes para alguna asignatura específica.</w:t>
+      </w:r>
+    </w:p>
+    <w:p>
+      <w:pPr>
+        <w:pStyle w:val="Prrafodelista"/>
+      </w:pPr>
+    </w:p>
+    <w:p>
+      <w:pPr>
+        <w:pStyle w:val="Prrafodelista"/>
+      </w:pPr>
+    </w:p>
+    <w:p>
+      <w:pPr>
+        <w:pStyle w:val="Prrafodelista"/>
+      </w:pPr>
+    </w:p>
+    <w:p>
+      <w:pPr>
+        <w:pStyle w:val="Prrafodelista"/>
+      </w:pPr>
+    </w:p>
+    <w:p>
+      <w:pPr>
+        <w:pStyle w:val="Prrafodelista"/>
+      </w:pPr>
+    </w:p>
+    <w:p>
+      <w:pPr>
+        <w:pStyle w:val="Prrafodelista"/>
+      </w:pPr>
+    </w:p>
+    <w:p>
+      <w:pPr>
+        <w:pStyle w:val="Prrafodelista"/>
+        <w:ind w:left="0"/>
+        <w:rPr>
+          <w:b/>
+          <w:bCs/>
+          <w:sz w:val="28"/>
+          <w:szCs w:val="28"/>
+        </w:rPr>
+      </w:pPr>
+      <w:r>
+        <w:rPr>
+          <w:b/>
+          <w:bCs/>
+          <w:sz w:val="28"/>
+          <w:szCs w:val="28"/>
+        </w:rPr>
+        <w:lastRenderedPageBreak/>
+        <w:t>Mejoras Futuras</w:t>
+      </w:r>
+    </w:p>
+    <w:p>
+      <w:pPr>
+        <w:pStyle w:val="Prrafodelista"/>
+        <w:ind w:left="0"/>
+      </w:pPr>
+      <w:r>
+        <w:t>Las mejoras que se podrían implementar son:</w:t>
+      </w:r>
+    </w:p>
+    <w:p>
+      <w:pPr>
+        <w:pStyle w:val="Prrafodelista"/>
+        <w:numPr>
+          <w:ilvl w:val="0"/>
+          <w:numId w:val="7"/>
+        </w:numPr>
+        <w:rPr>
+          <w:b/>
+          <w:bCs/>
+        </w:rPr>
+      </w:pPr>
+      <w:r>
+        <w:rPr>
+          <w:b/>
+          <w:bCs/>
+        </w:rPr>
+        <w:t>Sistema de notificaciones</w:t>
+      </w:r>
+      <w:r>
+        <w:rPr>
+          <w:b/>
+          <w:bCs/>
+        </w:rPr>
+        <w:t>:</w:t>
+      </w:r>
+    </w:p>
+    <w:p>
+      <w:pPr>
+        <w:pStyle w:val="Prrafodelista"/>
+        <w:numPr>
+          <w:ilvl w:val="1"/>
+          <w:numId w:val="7"/>
+        </w:numPr>
+      </w:pPr>
+      <w:r>
+        <w:t>Enviar notificaciones a los usuarios, ya sea al correo o en dispositivos móviles, para informar sobre algún tema de interés como material de apoyo, publicaciones de prácticas, etc.</w:t>
+      </w:r>
+    </w:p>
+    <w:p>
+      <w:pPr>
+        <w:pStyle w:val="Prrafodelista"/>
+        <w:ind w:left="1440"/>
+      </w:pPr>
+    </w:p>
+    <w:p>
+      <w:pPr>
+        <w:pStyle w:val="Prrafodelista"/>
+        <w:numPr>
+          <w:ilvl w:val="0"/>
+          <w:numId w:val="7"/>
+        </w:numPr>
+        <w:rPr>
+          <w:b/>
+          <w:bCs/>
+        </w:rPr>
+      </w:pPr>
+      <w:r>
+        <w:rPr>
+          <w:b/>
+          <w:bCs/>
+        </w:rPr>
+        <w:t>Aplicación para teléfonos/celulares</w:t>
+      </w:r>
+      <w:r>
+        <w:rPr>
+          <w:b/>
+          <w:bCs/>
+        </w:rPr>
+        <w:t>:</w:t>
+      </w:r>
+    </w:p>
+    <w:p>
+      <w:pPr>
+        <w:pStyle w:val="Prrafodelista"/>
+        <w:numPr>
+          <w:ilvl w:val="1"/>
+          <w:numId w:val="7"/>
+        </w:numPr>
+      </w:pPr>
+      <w:r>
+        <w:t>Portar la aplicación a dispositivos Android o iOS, facilitando el acceso a la app.</w:t>
+      </w:r>
+    </w:p>
+    <w:p>
+      <w:pPr>
+        <w:pStyle w:val="Prrafodelista"/>
+        <w:ind w:left="1440"/>
+      </w:pPr>
+    </w:p>
+    <w:p>
+      <w:pPr>
+        <w:pStyle w:val="Prrafodelista"/>
+        <w:numPr>
+          <w:ilvl w:val="0"/>
+          <w:numId w:val="7"/>
+        </w:numPr>
+        <w:rPr>
+          <w:b/>
+          <w:bCs/>
+        </w:rPr>
+      </w:pPr>
+      <w:r>
+        <w:rPr>
+          <w:b/>
+          <w:bCs/>
+        </w:rPr>
+        <w:t>Moderación de contenido</w:t>
+      </w:r>
+      <w:r>
+        <w:rPr>
+          <w:b/>
+          <w:bCs/>
+        </w:rPr>
+        <w:t>:</w:t>
+      </w:r>
+    </w:p>
+    <w:p>
+      <w:pPr>
+        <w:pStyle w:val="Prrafodelista"/>
+        <w:numPr>
+          <w:ilvl w:val="1"/>
+          <w:numId w:val="7"/>
+        </w:numPr>
+      </w:pPr>
+      <w:r>
+        <w:t>Implementar herramientas</w:t>
+      </w:r>
+      <w:r>
+        <w:t>/moderadores</w:t>
+      </w:r>
+      <w:r>
+        <w:t xml:space="preserve"> para controlar el contenido subido por alguien, en caso de que se suba algo inadecuado. Junto con dar seguridad a la información publicada.</w:t>
+      </w:r>
+    </w:p>
+    <w:p>
+      <w:pPr>
+        <w:pStyle w:val="Prrafodelista"/>
+        <w:ind w:left="1440"/>
+      </w:pPr>
+    </w:p>
+    <w:p>
+      <w:pPr>
+        <w:pStyle w:val="Prrafodelista"/>
+        <w:numPr>
+          <w:ilvl w:val="0"/>
+          <w:numId w:val="7"/>
+        </w:numPr>
+        <w:rPr>
+          <w:b/>
+          <w:bCs/>
+        </w:rPr>
+      </w:pPr>
+      <w:r>
+        <w:rPr>
+          <w:b/>
+          <w:bCs/>
+        </w:rPr>
+        <w:t>Sistema de valoración</w:t>
+      </w:r>
+      <w:r>
+        <w:rPr>
+          <w:b/>
+          <w:bCs/>
+        </w:rPr>
+        <w:t>:</w:t>
+      </w:r>
+    </w:p>
+    <w:p>
+      <w:pPr>
+        <w:pStyle w:val="Prrafodelista"/>
+        <w:numPr>
+          <w:ilvl w:val="1"/>
+          <w:numId w:val="7"/>
+        </w:numPr>
+      </w:pPr>
+      <w:r>
+        <w:t>Principalmente para calificar el contenido que se publica</w:t>
+      </w:r>
+      <w:r>
+        <w:t>, para destacar los contenidos más útiles de cada asignatura.</w:t>
+      </w:r>
+    </w:p>
+    <w:p>
+      <w:pPr>
+        <w:pStyle w:val="Prrafodelista"/>
+        <w:ind w:left="1440"/>
+      </w:pPr>
+    </w:p>
+    <w:p>
+      <w:pPr>
+        <w:pStyle w:val="Prrafodelista"/>
+        <w:numPr>
+          <w:ilvl w:val="0"/>
+          <w:numId w:val="7"/>
+        </w:numPr>
+        <w:rPr>
+          <w:b/>
+          <w:bCs/>
+        </w:rPr>
+      </w:pPr>
+      <w:r>
+        <w:rPr>
+          <w:b/>
+          <w:bCs/>
+        </w:rPr>
+        <w:t>Chat en tiempo real</w:t>
+      </w:r>
+      <w:r>
+        <w:rPr>
+          <w:b/>
+          <w:bCs/>
+        </w:rPr>
+        <w:t>:</w:t>
+      </w:r>
+    </w:p>
+    <w:p>
+      <w:pPr>
+        <w:pStyle w:val="Prrafodelista"/>
+        <w:numPr>
+          <w:ilvl w:val="1"/>
+          <w:numId w:val="7"/>
+        </w:numPr>
+      </w:pPr>
+      <w:r>
+        <w:t>Agregar un sistema de mensajes para tener comunicación instantánea para los estudiantes y profesores.</w:t>
+      </w:r>
+    </w:p>
+    <w:p/>
+    <w:p>
+      <w:pPr>
+        <w:rPr>
+          <w:b/>
+          <w:bCs/>
+          <w:sz w:val="28"/>
+          <w:szCs w:val="28"/>
+        </w:rPr>
+      </w:pPr>
+      <w:r>
+        <w:rPr>
+          <w:b/>
+          <w:bCs/>
+          <w:sz w:val="28"/>
+          <w:szCs w:val="28"/>
+        </w:rPr>
+        <w:t>Propuesta de valor del proyecto</w:t>
+      </w:r>
+    </w:p>
+    <w:p>
+      <w:pPr>
+        <w:pStyle w:val="Prrafodelista"/>
+        <w:ind w:left="0"/>
       </w:pPr>
     </w:p>
     <w:sectPr>
@@ -530,6 +1083,345 @@
     </w:lvl>
   </w:abstractNum>
   <w:abstractNum w:abstractNumId="1" w15:restartNumberingAfterBreak="0">
+    <w:nsid w:val="0EEA494A"/>
+    <w:multiLevelType w:val="hybridMultilevel"/>
+    <w:tmpl w:val="AF5AA1A6"/>
+    <w:lvl w:ilvl="0" w:tplc="340A0001">
+      <w:start w:val="1"/>
+      <w:numFmt w:val="bullet"/>
+      <w:lvlText w:val=""/>
+      <w:lvlJc w:val="left"/>
+      <w:pPr>
+        <w:ind w:left="720" w:hanging="360"/>
+      </w:pPr>
+      <w:rPr>
+        <w:rFonts w:ascii="Symbol" w:hAnsi="Symbol" w:hint="default"/>
+      </w:rPr>
+    </w:lvl>
+    <w:lvl w:ilvl="1" w:tplc="340A0003" w:tentative="1">
+      <w:start w:val="1"/>
+      <w:numFmt w:val="bullet"/>
+      <w:lvlText w:val="o"/>
+      <w:lvlJc w:val="left"/>
+      <w:pPr>
+        <w:ind w:left="1440" w:hanging="360"/>
+      </w:pPr>
+      <w:rPr>
+        <w:rFonts w:ascii="Courier New" w:hAnsi="Courier New" w:cs="Courier New" w:hint="default"/>
+      </w:rPr>
+    </w:lvl>
+    <w:lvl w:ilvl="2" w:tplc="340A0005" w:tentative="1">
+      <w:start w:val="1"/>
+      <w:numFmt w:val="bullet"/>
+      <w:lvlText w:val=""/>
+      <w:lvlJc w:val="left"/>
+      <w:pPr>
+        <w:ind w:left="2160" w:hanging="360"/>
+      </w:pPr>
+      <w:rPr>
+        <w:rFonts w:ascii="Wingdings" w:hAnsi="Wingdings" w:hint="default"/>
+      </w:rPr>
+    </w:lvl>
+    <w:lvl w:ilvl="3" w:tplc="340A0001" w:tentative="1">
+      <w:start w:val="1"/>
+      <w:numFmt w:val="bullet"/>
+      <w:lvlText w:val=""/>
+      <w:lvlJc w:val="left"/>
+      <w:pPr>
+        <w:ind w:left="2880" w:hanging="360"/>
+      </w:pPr>
+      <w:rPr>
+        <w:rFonts w:ascii="Symbol" w:hAnsi="Symbol" w:hint="default"/>
+      </w:rPr>
+    </w:lvl>
+    <w:lvl w:ilvl="4" w:tplc="340A0003" w:tentative="1">
+      <w:start w:val="1"/>
+      <w:numFmt w:val="bullet"/>
+      <w:lvlText w:val="o"/>
+      <w:lvlJc w:val="left"/>
+      <w:pPr>
+        <w:ind w:left="3600" w:hanging="360"/>
+      </w:pPr>
+      <w:rPr>
+        <w:rFonts w:ascii="Courier New" w:hAnsi="Courier New" w:cs="Courier New" w:hint="default"/>
+      </w:rPr>
+    </w:lvl>
+    <w:lvl w:ilvl="5" w:tplc="340A0005" w:tentative="1">
+      <w:start w:val="1"/>
+      <w:numFmt w:val="bullet"/>
+      <w:lvlText w:val=""/>
+      <w:lvlJc w:val="left"/>
+      <w:pPr>
+        <w:ind w:left="4320" w:hanging="360"/>
+      </w:pPr>
+      <w:rPr>
+        <w:rFonts w:ascii="Wingdings" w:hAnsi="Wingdings" w:hint="default"/>
+      </w:rPr>
+    </w:lvl>
+    <w:lvl w:ilvl="6" w:tplc="340A0001" w:tentative="1">
+      <w:start w:val="1"/>
+      <w:numFmt w:val="bullet"/>
+      <w:lvlText w:val=""/>
+      <w:lvlJc w:val="left"/>
+      <w:pPr>
+        <w:ind w:left="5040" w:hanging="360"/>
+      </w:pPr>
+      <w:rPr>
+        <w:rFonts w:ascii="Symbol" w:hAnsi="Symbol" w:hint="default"/>
+      </w:rPr>
+    </w:lvl>
+    <w:lvl w:ilvl="7" w:tplc="340A0003" w:tentative="1">
+      <w:start w:val="1"/>
+      <w:numFmt w:val="bullet"/>
+      <w:lvlText w:val="o"/>
+      <w:lvlJc w:val="left"/>
+      <w:pPr>
+        <w:ind w:left="5760" w:hanging="360"/>
+      </w:pPr>
+      <w:rPr>
+        <w:rFonts w:ascii="Courier New" w:hAnsi="Courier New" w:cs="Courier New" w:hint="default"/>
+      </w:rPr>
+    </w:lvl>
+    <w:lvl w:ilvl="8" w:tplc="340A0005" w:tentative="1">
+      <w:start w:val="1"/>
+      <w:numFmt w:val="bullet"/>
+      <w:lvlText w:val=""/>
+      <w:lvlJc w:val="left"/>
+      <w:pPr>
+        <w:ind w:left="6480" w:hanging="360"/>
+      </w:pPr>
+      <w:rPr>
+        <w:rFonts w:ascii="Wingdings" w:hAnsi="Wingdings" w:hint="default"/>
+      </w:rPr>
+    </w:lvl>
+  </w:abstractNum>
+  <w:abstractNum w:abstractNumId="2" w15:restartNumberingAfterBreak="0">
+    <w:nsid w:val="1A101F91"/>
+    <w:multiLevelType w:val="hybridMultilevel"/>
+    <w:tmpl w:val="89BA4ACE"/>
+    <w:lvl w:ilvl="0" w:tplc="340A0001">
+      <w:start w:val="1"/>
+      <w:numFmt w:val="bullet"/>
+      <w:lvlText w:val=""/>
+      <w:lvlJc w:val="left"/>
+      <w:pPr>
+        <w:ind w:left="720" w:hanging="360"/>
+      </w:pPr>
+      <w:rPr>
+        <w:rFonts w:ascii="Symbol" w:hAnsi="Symbol" w:hint="default"/>
+      </w:rPr>
+    </w:lvl>
+    <w:lvl w:ilvl="1" w:tplc="340A0003" w:tentative="1">
+      <w:start w:val="1"/>
+      <w:numFmt w:val="bullet"/>
+      <w:lvlText w:val="o"/>
+      <w:lvlJc w:val="left"/>
+      <w:pPr>
+        <w:ind w:left="1440" w:hanging="360"/>
+      </w:pPr>
+      <w:rPr>
+        <w:rFonts w:ascii="Courier New" w:hAnsi="Courier New" w:cs="Courier New" w:hint="default"/>
+      </w:rPr>
+    </w:lvl>
+    <w:lvl w:ilvl="2" w:tplc="340A0005" w:tentative="1">
+      <w:start w:val="1"/>
+      <w:numFmt w:val="bullet"/>
+      <w:lvlText w:val=""/>
+      <w:lvlJc w:val="left"/>
+      <w:pPr>
+        <w:ind w:left="2160" w:hanging="360"/>
+      </w:pPr>
+      <w:rPr>
+        <w:rFonts w:ascii="Wingdings" w:hAnsi="Wingdings" w:hint="default"/>
+      </w:rPr>
+    </w:lvl>
+    <w:lvl w:ilvl="3" w:tplc="340A0001" w:tentative="1">
+      <w:start w:val="1"/>
+      <w:numFmt w:val="bullet"/>
+      <w:lvlText w:val=""/>
+      <w:lvlJc w:val="left"/>
+      <w:pPr>
+        <w:ind w:left="2880" w:hanging="360"/>
+      </w:pPr>
+      <w:rPr>
+        <w:rFonts w:ascii="Symbol" w:hAnsi="Symbol" w:hint="default"/>
+      </w:rPr>
+    </w:lvl>
+    <w:lvl w:ilvl="4" w:tplc="340A0003" w:tentative="1">
+      <w:start w:val="1"/>
+      <w:numFmt w:val="bullet"/>
+      <w:lvlText w:val="o"/>
+      <w:lvlJc w:val="left"/>
+      <w:pPr>
+        <w:ind w:left="3600" w:hanging="360"/>
+      </w:pPr>
+      <w:rPr>
+        <w:rFonts w:ascii="Courier New" w:hAnsi="Courier New" w:cs="Courier New" w:hint="default"/>
+      </w:rPr>
+    </w:lvl>
+    <w:lvl w:ilvl="5" w:tplc="340A0005" w:tentative="1">
+      <w:start w:val="1"/>
+      <w:numFmt w:val="bullet"/>
+      <w:lvlText w:val=""/>
+      <w:lvlJc w:val="left"/>
+      <w:pPr>
+        <w:ind w:left="4320" w:hanging="360"/>
+      </w:pPr>
+      <w:rPr>
+        <w:rFonts w:ascii="Wingdings" w:hAnsi="Wingdings" w:hint="default"/>
+      </w:rPr>
+    </w:lvl>
+    <w:lvl w:ilvl="6" w:tplc="340A0001" w:tentative="1">
+      <w:start w:val="1"/>
+      <w:numFmt w:val="bullet"/>
+      <w:lvlText w:val=""/>
+      <w:lvlJc w:val="left"/>
+      <w:pPr>
+        <w:ind w:left="5040" w:hanging="360"/>
+      </w:pPr>
+      <w:rPr>
+        <w:rFonts w:ascii="Symbol" w:hAnsi="Symbol" w:hint="default"/>
+      </w:rPr>
+    </w:lvl>
+    <w:lvl w:ilvl="7" w:tplc="340A0003" w:tentative="1">
+      <w:start w:val="1"/>
+      <w:numFmt w:val="bullet"/>
+      <w:lvlText w:val="o"/>
+      <w:lvlJc w:val="left"/>
+      <w:pPr>
+        <w:ind w:left="5760" w:hanging="360"/>
+      </w:pPr>
+      <w:rPr>
+        <w:rFonts w:ascii="Courier New" w:hAnsi="Courier New" w:cs="Courier New" w:hint="default"/>
+      </w:rPr>
+    </w:lvl>
+    <w:lvl w:ilvl="8" w:tplc="340A0005" w:tentative="1">
+      <w:start w:val="1"/>
+      <w:numFmt w:val="bullet"/>
+      <w:lvlText w:val=""/>
+      <w:lvlJc w:val="left"/>
+      <w:pPr>
+        <w:ind w:left="6480" w:hanging="360"/>
+      </w:pPr>
+      <w:rPr>
+        <w:rFonts w:ascii="Wingdings" w:hAnsi="Wingdings" w:hint="default"/>
+      </w:rPr>
+    </w:lvl>
+  </w:abstractNum>
+  <w:abstractNum w:abstractNumId="3" w15:restartNumberingAfterBreak="0">
+    <w:nsid w:val="31FB2EEE"/>
+    <w:multiLevelType w:val="hybridMultilevel"/>
+    <w:tmpl w:val="4C8046DE"/>
+    <w:lvl w:ilvl="0" w:tplc="340A0001">
+      <w:start w:val="1"/>
+      <w:numFmt w:val="bullet"/>
+      <w:lvlText w:val=""/>
+      <w:lvlJc w:val="left"/>
+      <w:pPr>
+        <w:ind w:left="720" w:hanging="360"/>
+      </w:pPr>
+      <w:rPr>
+        <w:rFonts w:ascii="Symbol" w:hAnsi="Symbol" w:hint="default"/>
+      </w:rPr>
+    </w:lvl>
+    <w:lvl w:ilvl="1" w:tplc="340A0003">
+      <w:start w:val="1"/>
+      <w:numFmt w:val="bullet"/>
+      <w:lvlText w:val="o"/>
+      <w:lvlJc w:val="left"/>
+      <w:pPr>
+        <w:ind w:left="1440" w:hanging="360"/>
+      </w:pPr>
+      <w:rPr>
+        <w:rFonts w:ascii="Courier New" w:hAnsi="Courier New" w:cs="Courier New" w:hint="default"/>
+      </w:rPr>
+    </w:lvl>
+    <w:lvl w:ilvl="2" w:tplc="340A0005" w:tentative="1">
+      <w:start w:val="1"/>
+      <w:numFmt w:val="bullet"/>
+      <w:lvlText w:val=""/>
+      <w:lvlJc w:val="left"/>
+      <w:pPr>
+        <w:ind w:left="2160" w:hanging="360"/>
+      </w:pPr>
+      <w:rPr>
+        <w:rFonts w:ascii="Wingdings" w:hAnsi="Wingdings" w:hint="default"/>
+      </w:rPr>
+    </w:lvl>
+    <w:lvl w:ilvl="3" w:tplc="340A0001" w:tentative="1">
+      <w:start w:val="1"/>
+      <w:numFmt w:val="bullet"/>
+      <w:lvlText w:val=""/>
+      <w:lvlJc w:val="left"/>
+      <w:pPr>
+        <w:ind w:left="2880" w:hanging="360"/>
+      </w:pPr>
+      <w:rPr>
+        <w:rFonts w:ascii="Symbol" w:hAnsi="Symbol" w:hint="default"/>
+      </w:rPr>
+    </w:lvl>
+    <w:lvl w:ilvl="4" w:tplc="340A0003" w:tentative="1">
+      <w:start w:val="1"/>
+      <w:numFmt w:val="bullet"/>
+      <w:lvlText w:val="o"/>
+      <w:lvlJc w:val="left"/>
+      <w:pPr>
+        <w:ind w:left="3600" w:hanging="360"/>
+      </w:pPr>
+      <w:rPr>
+        <w:rFonts w:ascii="Courier New" w:hAnsi="Courier New" w:cs="Courier New" w:hint="default"/>
+      </w:rPr>
+    </w:lvl>
+    <w:lvl w:ilvl="5" w:tplc="340A0005" w:tentative="1">
+      <w:start w:val="1"/>
+      <w:numFmt w:val="bullet"/>
+      <w:lvlText w:val=""/>
+      <w:lvlJc w:val="left"/>
+      <w:pPr>
+        <w:ind w:left="4320" w:hanging="360"/>
+      </w:pPr>
+      <w:rPr>
+        <w:rFonts w:ascii="Wingdings" w:hAnsi="Wingdings" w:hint="default"/>
+      </w:rPr>
+    </w:lvl>
+    <w:lvl w:ilvl="6" w:tplc="340A0001" w:tentative="1">
+      <w:start w:val="1"/>
+      <w:numFmt w:val="bullet"/>
+      <w:lvlText w:val=""/>
+      <w:lvlJc w:val="left"/>
+      <w:pPr>
+        <w:ind w:left="5040" w:hanging="360"/>
+      </w:pPr>
+      <w:rPr>
+        <w:rFonts w:ascii="Symbol" w:hAnsi="Symbol" w:hint="default"/>
+      </w:rPr>
+    </w:lvl>
+    <w:lvl w:ilvl="7" w:tplc="340A0003" w:tentative="1">
+      <w:start w:val="1"/>
+      <w:numFmt w:val="bullet"/>
+      <w:lvlText w:val="o"/>
+      <w:lvlJc w:val="left"/>
+      <w:pPr>
+        <w:ind w:left="5760" w:hanging="360"/>
+      </w:pPr>
+      <w:rPr>
+        <w:rFonts w:ascii="Courier New" w:hAnsi="Courier New" w:cs="Courier New" w:hint="default"/>
+      </w:rPr>
+    </w:lvl>
+    <w:lvl w:ilvl="8" w:tplc="340A0005" w:tentative="1">
+      <w:start w:val="1"/>
+      <w:numFmt w:val="bullet"/>
+      <w:lvlText w:val=""/>
+      <w:lvlJc w:val="left"/>
+      <w:pPr>
+        <w:ind w:left="6480" w:hanging="360"/>
+      </w:pPr>
+      <w:rPr>
+        <w:rFonts w:ascii="Wingdings" w:hAnsi="Wingdings" w:hint="default"/>
+      </w:rPr>
+    </w:lvl>
+  </w:abstractNum>
+  <w:abstractNum w:abstractNumId="4" w15:restartNumberingAfterBreak="0">
     <w:nsid w:val="627A2ECF"/>
     <w:multiLevelType w:val="hybridMultilevel"/>
     <w:tmpl w:val="0B52CE22"/>
@@ -615,7 +1507,7 @@
       </w:pPr>
     </w:lvl>
   </w:abstractNum>
-  <w:abstractNum w:abstractNumId="2" w15:restartNumberingAfterBreak="0">
+  <w:abstractNum w:abstractNumId="5" w15:restartNumberingAfterBreak="0">
     <w:nsid w:val="755F216C"/>
     <w:multiLevelType w:val="hybridMultilevel"/>
     <w:tmpl w:val="B56A1AC4"/>
@@ -728,7 +1620,7 @@
       </w:rPr>
     </w:lvl>
   </w:abstractNum>
-  <w:abstractNum w:abstractNumId="3" w15:restartNumberingAfterBreak="0">
+  <w:abstractNum w:abstractNumId="6" w15:restartNumberingAfterBreak="0">
     <w:nsid w:val="7B6D516A"/>
     <w:multiLevelType w:val="hybridMultilevel"/>
     <w:tmpl w:val="0FAA487C"/>
@@ -842,16 +1734,25 @@
     </w:lvl>
   </w:abstractNum>
   <w:num w:numId="1" w16cid:durableId="1073357368">
-    <w:abstractNumId w:val="2"/>
+    <w:abstractNumId w:val="5"/>
   </w:num>
   <w:num w:numId="2" w16cid:durableId="67195714">
-    <w:abstractNumId w:val="1"/>
+    <w:abstractNumId w:val="4"/>
   </w:num>
   <w:num w:numId="3" w16cid:durableId="474302004">
-    <w:abstractNumId w:val="3"/>
+    <w:abstractNumId w:val="6"/>
   </w:num>
   <w:num w:numId="4" w16cid:durableId="160969207">
     <w:abstractNumId w:val="0"/>
+  </w:num>
+  <w:num w:numId="5" w16cid:durableId="1392578928">
+    <w:abstractNumId w:val="2"/>
+  </w:num>
+  <w:num w:numId="6" w16cid:durableId="1833251062">
+    <w:abstractNumId w:val="1"/>
+  </w:num>
+  <w:num w:numId="7" w16cid:durableId="1092243198">
+    <w:abstractNumId w:val="3"/>
   </w:num>
 </w:numbering>
 </file>

</xml_diff>